<commit_message>
Sample resume: Ritu Dadhwal's name, phone and LinkedIn
Co-Authored-By: Claude Opus 5.5 <noreply@anthropic.com>
</commit_message>
<xml_diff>
--- a/assets/sample-resume.docx
+++ b/assets/sample-resume.docx
@@ -15,7 +15,7 @@
           <w:color w:val="1F1F1F"/>
           <w:sz w:val="36"/>
         </w:rPr>
-        <w:t>Alex Sharma</w:t>
+        <w:t>Ritu Dadhwal</w:t>
       </w:r>
     </w:p>
     <w:p>
@@ -31,7 +31,7 @@
           <w:color w:val="555555"/>
           <w:sz w:val="19"/>
         </w:rPr>
-        <w:t>alex@example.com  |  +91 98765 43210  |  Bengaluru, India  |  linkedin.com/in/alexsharma</w:t>
+        <w:t>+91 86280 61175  |  linkedin.com/in/ritudadhwal4</w:t>
       </w:r>
     </w:p>
     <w:p>

</xml_diff>